<commit_message>
Registrar os dois orientadores nos resumos e no roteiro de fala
Rosemary Baptista Martins Teixeira e Ricardo Matsura Kodama passam a constar
no cabeçalho dos dois resumos e na abertura das duas versões da fala.

Co-Authored-By: Claude Opus 5 <noreply@anthropic.com>
Claude-Session: https://claude.ai/code/session_01KV9dw4gzFi44p1bVc4t4nV
</commit_message>
<xml_diff>
--- a/resumo-banner-pne/Fala_Apresentacao_Banner_TEA.docx
+++ b/resumo-banner-pne/Fala_Apresentacao_Banner_TEA.docx
@@ -104,7 +104,7 @@
           <w:i w:val="0"/>
           <w:sz w:val="23"/>
         </w:rPr>
-        <w:t>Bom dia! Meu nome é Thamyres Tosarelli, esse trabalho eu fiz junto com a Beatriz Gouvea, com orientação da professora Rosemary Martins. O nosso tema é o manejo odontológico do paciente com Transtorno do Espectro Autista nível 3, associado a TDAH e a Transtorno de Ansiedade Generalizada. Posso começar?</w:t>
+        <w:t>Bom dia! Meu nome é Thamyres Tosarelli, esse trabalho eu fiz junto com a Beatriz Gouvea, com orientação dos professores Rosemary Baptista Martins Teixeira e Ricardo Matsura Kodama. O nosso tema é o manejo odontológico do paciente com Transtorno do Espectro Autista nível 3, associado a TDAH e a Transtorno de Ansiedade Generalizada. Posso começar?</w:t>
       </w:r>
     </w:p>
     <w:p>
@@ -409,7 +409,7 @@
           <w:i w:val="0"/>
           <w:sz w:val="23"/>
         </w:rPr>
-        <w:t>Bom dia! Eu sou a Thamyres, esse trabalho é meu e da Beatriz, orientado pela professora Rosemary. A gente fez uma revisão de literatura sobre o manejo do paciente com autismo nível 3 associado a TDAH e ansiedade generalizada, a partir de uma paciente de oito anos que a gente atende na clínica.</w:t>
+        <w:t>Bom dia! Eu sou a Thamyres, esse trabalho é meu e da Beatriz, orientado pela professora Rosemary Baptista Martins Teixeira e pelo professor Ricardo Matsura Kodama. A gente fez uma revisão de literatura sobre o manejo do paciente com autismo nível 3 associado a TDAH e ansiedade generalizada, a partir de uma paciente de oito anos que a gente atende na clínica.</w:t>
       </w:r>
     </w:p>
     <w:p>

</xml_diff>